<commit_message>
Desafio 1: informe 1 ejemplo mascaras
</commit_message>
<xml_diff>
--- a/Teoria/Desafio 1/Informe 1.docx
+++ b/Teoria/Desafio 1/Informe 1.docx
@@ -1,6 +1,6 @@
 
 <file path=word/document.xml><?xml version="1.0" encoding="utf-8"?>
-<w:document xmlns:wpc="http://schemas.microsoft.com/office/word/2010/wordprocessingCanvas" xmlns:cx="http://schemas.microsoft.com/office/drawing/2014/chartex" xmlns:cx1="http://schemas.microsoft.com/office/drawing/2015/9/8/chartex" xmlns:cx2="http://schemas.microsoft.com/office/drawing/2015/10/21/chartex" xmlns:cx3="http://schemas.microsoft.com/office/drawing/2016/5/9/chartex" xmlns:cx4="http://schemas.microsoft.com/office/drawing/2016/5/10/chartex" xmlns:cx5="http://schemas.microsoft.com/office/drawing/2016/5/11/chartex" xmlns:cx6="http://schemas.microsoft.com/office/drawing/2016/5/12/chartex" xmlns:cx7="http://schemas.microsoft.com/office/drawing/2016/5/13/chartex" xmlns:cx8="http://schemas.microsoft.com/office/drawing/2016/5/14/chartex" xmlns:mc="http://schemas.openxmlformats.org/markup-compatibility/2006" xmlns:aink="http://schemas.microsoft.com/office/drawing/2016/ink" xmlns:am3d="http://schemas.microsoft.com/office/drawing/2017/model3d" xmlns:o="urn:schemas-microsoft-com:office:office" xmlns:oel="http://schemas.microsoft.com/office/2019/extlst" xmlns:r="http://schemas.openxmlformats.org/officeDocument/2006/relationships" xmlns:m="http://schemas.openxmlformats.org/officeDocument/2006/math" xmlns:v="urn:schemas-microsoft-com:vml" xmlns:wp14="http://schemas.microsoft.com/office/word/2010/wordprocessingDrawing" xmlns:wp="http://schemas.openxmlformats.org/drawingml/2006/wordprocessingDrawing" xmlns:w10="urn:schemas-microsoft-com:office:word" xmlns:w="http://schemas.openxmlformats.org/wordprocessingml/2006/main" xmlns:w14="http://schemas.microsoft.com/office/word/2010/wordml" xmlns:w15="http://schemas.microsoft.com/office/word/2012/wordml" xmlns:w16cex="http://schemas.microsoft.com/office/word/2018/wordml/cex" xmlns:w16cid="http://schemas.microsoft.com/office/word/2016/wordml/cid" xmlns:w16="http://schemas.microsoft.com/office/word/2018/wordml" xmlns:w16du="http://schemas.microsoft.com/office/word/2023/wordml/word16du" xmlns:w16sdtdh="http://schemas.microsoft.com/office/word/2020/wordml/sdtdatahash" xmlns:w16sdtfl="http://schemas.microsoft.com/office/word/2024/wordml/sdtformatlock" xmlns:w16se="http://schemas.microsoft.com/office/word/2015/wordml/symex" xmlns:wpg="http://schemas.microsoft.com/office/word/2010/wordprocessingGroup" xmlns:wpi="http://schemas.microsoft.com/office/word/2010/wordprocessingInk" xmlns:wne="http://schemas.microsoft.com/office/word/2006/wordml" xmlns:wps="http://schemas.microsoft.com/office/word/2010/wordprocessingShape" mc:Ignorable="w14 w15 w16se w16cid w16 w16cex w16sdtdh w16sdtfl w16du wp14">
+<w:document xmlns:wpc="http://schemas.microsoft.com/office/word/2010/wordprocessingCanvas" xmlns:cx="http://schemas.microsoft.com/office/drawing/2014/chartex" xmlns:cx1="http://schemas.microsoft.com/office/drawing/2015/9/8/chartex" xmlns:cx2="http://schemas.microsoft.com/office/drawing/2015/10/21/chartex" xmlns:cx3="http://schemas.microsoft.com/office/drawing/2016/5/9/chartex" xmlns:cx4="http://schemas.microsoft.com/office/drawing/2016/5/10/chartex" xmlns:cx5="http://schemas.microsoft.com/office/drawing/2016/5/11/chartex" xmlns:cx6="http://schemas.microsoft.com/office/drawing/2016/5/12/chartex" xmlns:cx7="http://schemas.microsoft.com/office/drawing/2016/5/13/chartex" xmlns:cx8="http://schemas.microsoft.com/office/drawing/2016/5/14/chartex" xmlns:mc="http://schemas.openxmlformats.org/markup-compatibility/2006" xmlns:aink="http://schemas.microsoft.com/office/drawing/2016/ink" xmlns:am3d="http://schemas.microsoft.com/office/drawing/2017/model3d" xmlns:o="urn:schemas-microsoft-com:office:office" xmlns:oel="http://schemas.microsoft.com/office/2019/extlst" xmlns:r="http://schemas.openxmlformats.org/officeDocument/2006/relationships" xmlns:m="http://schemas.openxmlformats.org/officeDocument/2006/math" xmlns:v="urn:schemas-microsoft-com:vml" xmlns:wp14="http://schemas.microsoft.com/office/word/2010/wordprocessingDrawing" xmlns:wp="http://schemas.openxmlformats.org/drawingml/2006/wordprocessingDrawing" xmlns:w10="urn:schemas-microsoft-com:office:word" xmlns:w="http://schemas.openxmlformats.org/wordprocessingml/2006/main" xmlns:w14="http://schemas.microsoft.com/office/word/2010/wordml" xmlns:w15="http://schemas.microsoft.com/office/word/2012/wordml" xmlns:w16cex="http://schemas.microsoft.com/office/word/2018/wordml/cex" xmlns:w16cid="http://schemas.microsoft.com/office/word/2016/wordml/cid" xmlns:w16="http://schemas.microsoft.com/office/word/2018/wordml" xmlns:w16sdtdh="http://schemas.microsoft.com/office/word/2020/wordml/sdtdatahash" xmlns:w16se="http://schemas.microsoft.com/office/word/2015/wordml/symex" xmlns:wpg="http://schemas.microsoft.com/office/word/2010/wordprocessingGroup" xmlns:wpi="http://schemas.microsoft.com/office/word/2010/wordprocessingInk" xmlns:wne="http://schemas.microsoft.com/office/word/2006/wordml" xmlns:wps="http://schemas.microsoft.com/office/word/2010/wordprocessingShape" mc:Ignorable="w14 w15 w16se w16cid w16 w16cex w16sdtdh wp14">
   <w:body>
     <w:p>
       <w:pPr>
@@ -264,15 +264,7 @@
       </w:r>
       <w:proofErr w:type="gramEnd"/>
       <w:r>
-        <w:t xml:space="preserve">, </w:t>
-      </w:r>
-      <w:proofErr w:type="gramStart"/>
-      <w:r>
-        <w:t>OR )</w:t>
-      </w:r>
-      <w:proofErr w:type="gramEnd"/>
-      <w:r>
-        <w:t>.</w:t>
+        <w:t>, OR ).</w:t>
       </w:r>
     </w:p>
     <w:p>
@@ -391,6 +383,14 @@
       <w:proofErr w:type="spellEnd"/>
       <w:r>
         <w:t>) seguido de la inserción del nuevo valor mediante superposición OR (|).</w:t>
+      </w:r>
+      <w:r>
+        <w:t xml:space="preserve"> </w:t>
+      </w:r>
+    </w:p>
+    <w:p>
+      <w:r>
+        <w:t xml:space="preserve">Ejemplo de uso de mascaras </w:t>
       </w:r>
     </w:p>
     <w:p/>
@@ -405,7 +405,7 @@
 </file>
 
 <file path=word/numbering.xml><?xml version="1.0" encoding="utf-8"?>
-<w:numbering xmlns:wpc="http://schemas.microsoft.com/office/word/2010/wordprocessingCanvas" xmlns:cx="http://schemas.microsoft.com/office/drawing/2014/chartex" xmlns:cx1="http://schemas.microsoft.com/office/drawing/2015/9/8/chartex" xmlns:cx2="http://schemas.microsoft.com/office/drawing/2015/10/21/chartex" xmlns:cx3="http://schemas.microsoft.com/office/drawing/2016/5/9/chartex" xmlns:cx4="http://schemas.microsoft.com/office/drawing/2016/5/10/chartex" xmlns:cx5="http://schemas.microsoft.com/office/drawing/2016/5/11/chartex" xmlns:cx6="http://schemas.microsoft.com/office/drawing/2016/5/12/chartex" xmlns:cx7="http://schemas.microsoft.com/office/drawing/2016/5/13/chartex" xmlns:cx8="http://schemas.microsoft.com/office/drawing/2016/5/14/chartex" xmlns:mc="http://schemas.openxmlformats.org/markup-compatibility/2006" xmlns:aink="http://schemas.microsoft.com/office/drawing/2016/ink" xmlns:am3d="http://schemas.microsoft.com/office/drawing/2017/model3d" xmlns:o="urn:schemas-microsoft-com:office:office" xmlns:oel="http://schemas.microsoft.com/office/2019/extlst" xmlns:r="http://schemas.openxmlformats.org/officeDocument/2006/relationships" xmlns:m="http://schemas.openxmlformats.org/officeDocument/2006/math" xmlns:v="urn:schemas-microsoft-com:vml" xmlns:wp14="http://schemas.microsoft.com/office/word/2010/wordprocessingDrawing" xmlns:wp="http://schemas.openxmlformats.org/drawingml/2006/wordprocessingDrawing" xmlns:w10="urn:schemas-microsoft-com:office:word" xmlns:w="http://schemas.openxmlformats.org/wordprocessingml/2006/main" xmlns:w14="http://schemas.microsoft.com/office/word/2010/wordml" xmlns:w15="http://schemas.microsoft.com/office/word/2012/wordml" xmlns:w16cex="http://schemas.microsoft.com/office/word/2018/wordml/cex" xmlns:w16cid="http://schemas.microsoft.com/office/word/2016/wordml/cid" xmlns:w16="http://schemas.microsoft.com/office/word/2018/wordml" xmlns:w16du="http://schemas.microsoft.com/office/word/2023/wordml/word16du" xmlns:w16sdtdh="http://schemas.microsoft.com/office/word/2020/wordml/sdtdatahash" xmlns:w16sdtfl="http://schemas.microsoft.com/office/word/2024/wordml/sdtformatlock" xmlns:w16se="http://schemas.microsoft.com/office/word/2015/wordml/symex" xmlns:wpg="http://schemas.microsoft.com/office/word/2010/wordprocessingGroup" xmlns:wpi="http://schemas.microsoft.com/office/word/2010/wordprocessingInk" xmlns:wne="http://schemas.microsoft.com/office/word/2006/wordml" xmlns:wps="http://schemas.microsoft.com/office/word/2010/wordprocessingShape" mc:Ignorable="w14 w15 w16se w16cid w16 w16cex w16sdtdh w16sdtfl w16du wp14">
+<w:numbering xmlns:wpc="http://schemas.microsoft.com/office/word/2010/wordprocessingCanvas" xmlns:cx="http://schemas.microsoft.com/office/drawing/2014/chartex" xmlns:cx1="http://schemas.microsoft.com/office/drawing/2015/9/8/chartex" xmlns:cx2="http://schemas.microsoft.com/office/drawing/2015/10/21/chartex" xmlns:cx3="http://schemas.microsoft.com/office/drawing/2016/5/9/chartex" xmlns:cx4="http://schemas.microsoft.com/office/drawing/2016/5/10/chartex" xmlns:cx5="http://schemas.microsoft.com/office/drawing/2016/5/11/chartex" xmlns:cx6="http://schemas.microsoft.com/office/drawing/2016/5/12/chartex" xmlns:cx7="http://schemas.microsoft.com/office/drawing/2016/5/13/chartex" xmlns:cx8="http://schemas.microsoft.com/office/drawing/2016/5/14/chartex" xmlns:mc="http://schemas.openxmlformats.org/markup-compatibility/2006" xmlns:aink="http://schemas.microsoft.com/office/drawing/2016/ink" xmlns:am3d="http://schemas.microsoft.com/office/drawing/2017/model3d" xmlns:o="urn:schemas-microsoft-com:office:office" xmlns:oel="http://schemas.microsoft.com/office/2019/extlst" xmlns:r="http://schemas.openxmlformats.org/officeDocument/2006/relationships" xmlns:m="http://schemas.openxmlformats.org/officeDocument/2006/math" xmlns:v="urn:schemas-microsoft-com:vml" xmlns:wp14="http://schemas.microsoft.com/office/word/2010/wordprocessingDrawing" xmlns:wp="http://schemas.openxmlformats.org/drawingml/2006/wordprocessingDrawing" xmlns:w10="urn:schemas-microsoft-com:office:word" xmlns:w="http://schemas.openxmlformats.org/wordprocessingml/2006/main" xmlns:w14="http://schemas.microsoft.com/office/word/2010/wordml" xmlns:w15="http://schemas.microsoft.com/office/word/2012/wordml" xmlns:w16cex="http://schemas.microsoft.com/office/word/2018/wordml/cex" xmlns:w16cid="http://schemas.microsoft.com/office/word/2016/wordml/cid" xmlns:w16="http://schemas.microsoft.com/office/word/2018/wordml" xmlns:w16sdtdh="http://schemas.microsoft.com/office/word/2020/wordml/sdtdatahash" xmlns:w16se="http://schemas.microsoft.com/office/word/2015/wordml/symex" xmlns:wpg="http://schemas.microsoft.com/office/word/2010/wordprocessingGroup" xmlns:wpi="http://schemas.microsoft.com/office/word/2010/wordprocessingInk" xmlns:wne="http://schemas.microsoft.com/office/word/2006/wordml" xmlns:wps="http://schemas.microsoft.com/office/word/2010/wordprocessingShape" mc:Ignorable="w14 w15 w16se w16cid w16 w16cex w16sdtdh wp14">
   <w:abstractNum w:abstractNumId="0" w15:restartNumberingAfterBreak="0">
     <w:nsid w:val="35762129"/>
     <w:multiLevelType w:val="multilevel"/>
@@ -526,7 +526,7 @@
 </file>
 
 <file path=word/styles.xml><?xml version="1.0" encoding="utf-8"?>
-<w:styles xmlns:mc="http://schemas.openxmlformats.org/markup-compatibility/2006" xmlns:r="http://schemas.openxmlformats.org/officeDocument/2006/relationships" xmlns:w="http://schemas.openxmlformats.org/wordprocessingml/2006/main" xmlns:w14="http://schemas.microsoft.com/office/word/2010/wordml" xmlns:w15="http://schemas.microsoft.com/office/word/2012/wordml" xmlns:w16cex="http://schemas.microsoft.com/office/word/2018/wordml/cex" xmlns:w16cid="http://schemas.microsoft.com/office/word/2016/wordml/cid" xmlns:w16="http://schemas.microsoft.com/office/word/2018/wordml" xmlns:w16du="http://schemas.microsoft.com/office/word/2023/wordml/word16du" xmlns:w16sdtdh="http://schemas.microsoft.com/office/word/2020/wordml/sdtdatahash" xmlns:w16sdtfl="http://schemas.microsoft.com/office/word/2024/wordml/sdtformatlock" xmlns:w16se="http://schemas.microsoft.com/office/word/2015/wordml/symex" mc:Ignorable="w14 w15 w16se w16cid w16 w16cex w16sdtdh w16sdtfl w16du">
+<w:styles xmlns:mc="http://schemas.openxmlformats.org/markup-compatibility/2006" xmlns:r="http://schemas.openxmlformats.org/officeDocument/2006/relationships" xmlns:w="http://schemas.openxmlformats.org/wordprocessingml/2006/main" xmlns:w14="http://schemas.microsoft.com/office/word/2010/wordml" xmlns:w15="http://schemas.microsoft.com/office/word/2012/wordml" xmlns:w16cex="http://schemas.microsoft.com/office/word/2018/wordml/cex" xmlns:w16cid="http://schemas.microsoft.com/office/word/2016/wordml/cid" xmlns:w16="http://schemas.microsoft.com/office/word/2018/wordml" xmlns:w16sdtdh="http://schemas.microsoft.com/office/word/2020/wordml/sdtdatahash" xmlns:w16se="http://schemas.microsoft.com/office/word/2015/wordml/symex" mc:Ignorable="w14 w15 w16se w16cid w16 w16cex w16sdtdh">
   <w:docDefaults>
     <w:rPrDefault>
       <w:rPr>
@@ -1162,6 +1162,7 @@
   <w:style w:type="character" w:default="1" w:styleId="Fuentedeprrafopredeter">
     <w:name w:val="Default Paragraph Font"/>
     <w:uiPriority w:val="1"/>
+    <w:semiHidden/>
     <w:unhideWhenUsed/>
   </w:style>
   <w:style w:type="table" w:default="1" w:styleId="Tablanormal">

</xml_diff>

<commit_message>
Analisis completo pero con probabilidad de cambios.
</commit_message>
<xml_diff>
--- a/Teoria/Desafio 1/Informe 1.docx
+++ b/Teoria/Desafio 1/Informe 1.docx
@@ -1,6 +1,6 @@
 
 <file path=word/document.xml><?xml version="1.0" encoding="utf-8"?>
-<w:document xmlns:wpc="http://schemas.microsoft.com/office/word/2010/wordprocessingCanvas" xmlns:cx="http://schemas.microsoft.com/office/drawing/2014/chartex" xmlns:cx1="http://schemas.microsoft.com/office/drawing/2015/9/8/chartex" xmlns:cx2="http://schemas.microsoft.com/office/drawing/2015/10/21/chartex" xmlns:cx3="http://schemas.microsoft.com/office/drawing/2016/5/9/chartex" xmlns:cx4="http://schemas.microsoft.com/office/drawing/2016/5/10/chartex" xmlns:cx5="http://schemas.microsoft.com/office/drawing/2016/5/11/chartex" xmlns:cx6="http://schemas.microsoft.com/office/drawing/2016/5/12/chartex" xmlns:cx7="http://schemas.microsoft.com/office/drawing/2016/5/13/chartex" xmlns:cx8="http://schemas.microsoft.com/office/drawing/2016/5/14/chartex" xmlns:mc="http://schemas.openxmlformats.org/markup-compatibility/2006" xmlns:aink="http://schemas.microsoft.com/office/drawing/2016/ink" xmlns:am3d="http://schemas.microsoft.com/office/drawing/2017/model3d" xmlns:o="urn:schemas-microsoft-com:office:office" xmlns:oel="http://schemas.microsoft.com/office/2019/extlst" xmlns:r="http://schemas.openxmlformats.org/officeDocument/2006/relationships" xmlns:m="http://schemas.openxmlformats.org/officeDocument/2006/math" xmlns:v="urn:schemas-microsoft-com:vml" xmlns:wp14="http://schemas.microsoft.com/office/word/2010/wordprocessingDrawing" xmlns:wp="http://schemas.openxmlformats.org/drawingml/2006/wordprocessingDrawing" xmlns:w10="urn:schemas-microsoft-com:office:word" xmlns:w="http://schemas.openxmlformats.org/wordprocessingml/2006/main" xmlns:w14="http://schemas.microsoft.com/office/word/2010/wordml" xmlns:w15="http://schemas.microsoft.com/office/word/2012/wordml" xmlns:w16cex="http://schemas.microsoft.com/office/word/2018/wordml/cex" xmlns:w16cid="http://schemas.microsoft.com/office/word/2016/wordml/cid" xmlns:w16="http://schemas.microsoft.com/office/word/2018/wordml" xmlns:w16sdtdh="http://schemas.microsoft.com/office/word/2020/wordml/sdtdatahash" xmlns:w16se="http://schemas.microsoft.com/office/word/2015/wordml/symex" xmlns:wpg="http://schemas.microsoft.com/office/word/2010/wordprocessingGroup" xmlns:wpi="http://schemas.microsoft.com/office/word/2010/wordprocessingInk" xmlns:wne="http://schemas.microsoft.com/office/word/2006/wordml" xmlns:wps="http://schemas.microsoft.com/office/word/2010/wordprocessingShape" mc:Ignorable="w14 w15 w16se w16cid w16 w16cex w16sdtdh wp14">
+<w:document xmlns:wpc="http://schemas.microsoft.com/office/word/2010/wordprocessingCanvas" xmlns:cx="http://schemas.microsoft.com/office/drawing/2014/chartex" xmlns:cx1="http://schemas.microsoft.com/office/drawing/2015/9/8/chartex" xmlns:cx2="http://schemas.microsoft.com/office/drawing/2015/10/21/chartex" xmlns:cx3="http://schemas.microsoft.com/office/drawing/2016/5/9/chartex" xmlns:cx4="http://schemas.microsoft.com/office/drawing/2016/5/10/chartex" xmlns:cx5="http://schemas.microsoft.com/office/drawing/2016/5/11/chartex" xmlns:cx6="http://schemas.microsoft.com/office/drawing/2016/5/12/chartex" xmlns:cx7="http://schemas.microsoft.com/office/drawing/2016/5/13/chartex" xmlns:cx8="http://schemas.microsoft.com/office/drawing/2016/5/14/chartex" xmlns:mc="http://schemas.openxmlformats.org/markup-compatibility/2006" xmlns:aink="http://schemas.microsoft.com/office/drawing/2016/ink" xmlns:am3d="http://schemas.microsoft.com/office/drawing/2017/model3d" xmlns:o="urn:schemas-microsoft-com:office:office" xmlns:oel="http://schemas.microsoft.com/office/2019/extlst" xmlns:r="http://schemas.openxmlformats.org/officeDocument/2006/relationships" xmlns:m="http://schemas.openxmlformats.org/officeDocument/2006/math" xmlns:v="urn:schemas-microsoft-com:vml" xmlns:wp14="http://schemas.microsoft.com/office/word/2010/wordprocessingDrawing" xmlns:wp="http://schemas.openxmlformats.org/drawingml/2006/wordprocessingDrawing" xmlns:w10="urn:schemas-microsoft-com:office:word" xmlns:w="http://schemas.openxmlformats.org/wordprocessingml/2006/main" xmlns:w14="http://schemas.microsoft.com/office/word/2010/wordml" xmlns:w15="http://schemas.microsoft.com/office/word/2012/wordml" xmlns:w16cex="http://schemas.microsoft.com/office/word/2018/wordml/cex" xmlns:w16cid="http://schemas.microsoft.com/office/word/2016/wordml/cid" xmlns:w16="http://schemas.microsoft.com/office/word/2018/wordml" xmlns:w16du="http://schemas.microsoft.com/office/word/2023/wordml/word16du" xmlns:w16sdtdh="http://schemas.microsoft.com/office/word/2020/wordml/sdtdatahash" xmlns:w16sdtfl="http://schemas.microsoft.com/office/word/2024/wordml/sdtformatlock" xmlns:w16se="http://schemas.microsoft.com/office/word/2015/wordml/symex" xmlns:wpg="http://schemas.microsoft.com/office/word/2010/wordprocessingGroup" xmlns:wpi="http://schemas.microsoft.com/office/word/2010/wordprocessingInk" xmlns:wne="http://schemas.microsoft.com/office/word/2006/wordml" xmlns:wps="http://schemas.microsoft.com/office/word/2010/wordprocessingShape" mc:Ignorable="w14 w15 w16se w16cid w16 w16cex w16sdtdh w16sdtfl w16du wp14">
   <w:body>
     <w:p>
       <w:pPr>
@@ -177,220 +177,1058 @@
       </w:r>
     </w:p>
     <w:p>
-      <w:r>
-        <w:lastRenderedPageBreak/>
-        <w:t>Análisis</w:t>
-      </w:r>
-      <w:r>
-        <w:t xml:space="preserve"> a nivel de bits del </w:t>
-      </w:r>
-      <w:proofErr w:type="spellStart"/>
-      <w:r>
-        <w:t>sweet</w:t>
-      </w:r>
-      <w:proofErr w:type="spellEnd"/>
-      <w:r>
-        <w:t xml:space="preserve"> </w:t>
-      </w:r>
-      <w:proofErr w:type="spellStart"/>
-      <w:r>
-        <w:t>crush</w:t>
-      </w:r>
-      <w:proofErr w:type="spellEnd"/>
-      <w:r>
-        <w:t xml:space="preserve"> </w:t>
-      </w:r>
-    </w:p>
-    <w:p>
-      <w:r>
-        <w:t xml:space="preserve">En este juego se nos pide que cada ficha ocupe exactamente 3 bits lo que da </w:t>
-      </w:r>
-      <w:r>
-        <w:t>al meollo</w:t>
-      </w:r>
-      <w:r>
-        <w:t xml:space="preserve"> del asunto ya que normalmente se </w:t>
-      </w:r>
-      <w:r>
-        <w:t>utilizaría</w:t>
-      </w:r>
-      <w:r>
-        <w:t xml:space="preserve"> una matriz donde cada ficha ocupa su propio </w:t>
-      </w:r>
-      <w:proofErr w:type="spellStart"/>
-      <w:r>
-        <w:t>int</w:t>
-      </w:r>
-      <w:proofErr w:type="spellEnd"/>
-      <w:r>
-        <w:t xml:space="preserve"> o </w:t>
-      </w:r>
-      <w:proofErr w:type="spellStart"/>
-      <w:r>
-        <w:t>char</w:t>
-      </w:r>
-      <w:proofErr w:type="spellEnd"/>
-      <w:r>
-        <w:t xml:space="preserve"> pero ya que se nos piden que cada ficha ocupe 3 bits es donde este el problema ya que por ejemplo la ficha 1 ocupa los bits 0, 1 y 2 del primer byte, la ficha 2 ocupa los bits 3, 4 y 5 del primer byte y la ficha 3 ocupa los bits 6, 7 del primer byte y el bit 0 del segundo byte</w:t>
-      </w:r>
-      <w:r>
-        <w:t xml:space="preserve"> así que como solución a este detalle de los tres bits se tiene que trabajar con matemática binaria (&amp;, | , &lt;&lt; , &gt;&gt;)</w:t>
-      </w:r>
-      <w:r>
-        <w:t>. Todas estas fichas existen en un arreglo (</w:t>
-      </w:r>
-      <w:proofErr w:type="spellStart"/>
-      <w:r>
-        <w:t>unsigned</w:t>
-      </w:r>
-      <w:proofErr w:type="spellEnd"/>
-      <w:r>
-        <w:t xml:space="preserve"> </w:t>
-      </w:r>
-      <w:proofErr w:type="spellStart"/>
-      <w:r>
-        <w:t>char</w:t>
-      </w:r>
-      <w:proofErr w:type="spellEnd"/>
-      <w:r>
-        <w:t>*) y para poder manipular los cambios de estos 3 bits se utilizarán mascaras</w:t>
-      </w:r>
-      <w:r>
-        <w:t xml:space="preserve"> </w:t>
-      </w:r>
-      <w:proofErr w:type="gramStart"/>
-      <w:r>
-        <w:t>( AND</w:t>
-      </w:r>
-      <w:proofErr w:type="gramEnd"/>
-      <w:r>
-        <w:t>, OR ).</w:t>
-      </w:r>
-    </w:p>
-    <w:p>
-      <w:r>
-        <w:br/>
-      </w:r>
-      <w:r>
-        <w:rPr>
+      <w:pPr>
+        <w:rPr>
+          <w:rFonts w:ascii="Arial" w:hAnsi="Arial" w:cs="Arial"/>
           <w:b/>
           <w:bCs/>
         </w:rPr>
-        <w:t>Análisis de la Representación Compacta de Datos:</w:t>
-      </w:r>
-      <w:r>
-        <w:t xml:space="preserve"> El núcleo del desafío radica en la restricción de almacenamiento: cada ficha debe ocupar exactamente 3 bits en memoria. En una implementación convencional, se utilizaría una matriz donde cada elemento ocupa un tipo nativo completo (</w:t>
-      </w:r>
-      <w:proofErr w:type="spellStart"/>
-      <w:r>
-        <w:t>int</w:t>
-      </w:r>
-      <w:proofErr w:type="spellEnd"/>
-      <w:r>
-        <w:t xml:space="preserve"> de 32 bits o </w:t>
-      </w:r>
-      <w:proofErr w:type="spellStart"/>
-      <w:r>
-        <w:t>char</w:t>
-      </w:r>
-      <w:proofErr w:type="spellEnd"/>
-      <w:r>
-        <w:t xml:space="preserve"> de 8 bits), lo que provocaría un desperdicio del 87.5% de la memoria asignada por casilla.</w:t>
-      </w:r>
-    </w:p>
-    <w:p>
-      <w:r>
-        <w:t xml:space="preserve">Para optimizar el espacio al 100%, la solución utiliza un arreglo dinámico unidimensional de tipo </w:t>
-      </w:r>
-      <w:proofErr w:type="spellStart"/>
-      <w:r>
-        <w:t>unsigned</w:t>
-      </w:r>
-      <w:proofErr w:type="spellEnd"/>
-      <w:r>
-        <w:t xml:space="preserve"> </w:t>
-      </w:r>
-      <w:proofErr w:type="spellStart"/>
-      <w:r>
-        <w:t>char</w:t>
-      </w:r>
-      <w:proofErr w:type="spellEnd"/>
-      <w:r>
-        <w:t>*. Dado que la memoria RAM se direcciona en paquetes rígidos de 8 bits (1 Byte) y cada ficha requiere 3 bits, las fronteras de las fichas no coinciden con las fronteras de los bytes.</w:t>
-      </w:r>
-    </w:p>
-    <w:p>
-      <w:r>
-        <w:t>Como consecuencia, surgen dos casos de almacenamiento:</w:t>
-      </w:r>
-    </w:p>
-    <w:p>
-      <w:pPr>
-        <w:numPr>
-          <w:ilvl w:val="0"/>
-          <w:numId w:val="1"/>
-        </w:numPr>
-      </w:pPr>
-      <w:r>
-        <w:rPr>
+      </w:pPr>
+      <w:r>
+        <w:rPr>
+          <w:rFonts w:ascii="Arial" w:hAnsi="Arial" w:cs="Arial"/>
           <w:b/>
           <w:bCs/>
         </w:rPr>
-        <w:t>Ficha contenida en un único Byte:</w:t>
-      </w:r>
-      <w:r>
-        <w:t xml:space="preserve"> Por ejemplo, la Ficha 0 ocupa los bits [0, 1, 2] del Byte 0, y la Ficha 1 ocupa los bits [3, 4, 5] del mismo byte.</w:t>
-      </w:r>
-    </w:p>
-    <w:p>
-      <w:pPr>
-        <w:numPr>
-          <w:ilvl w:val="0"/>
-          <w:numId w:val="1"/>
-        </w:numPr>
-      </w:pPr>
-      <w:r>
-        <w:rPr>
+        <w:lastRenderedPageBreak/>
+        <w:t>Sweet Crush mediante manipulación de bits en C++</w:t>
+      </w:r>
+    </w:p>
+    <w:p>
+      <w:pPr>
+        <w:rPr>
+          <w:rFonts w:ascii="Arial" w:hAnsi="Arial" w:cs="Arial"/>
           <w:b/>
           <w:bCs/>
         </w:rPr>
-        <w:t>Ficha dividida entre dos Bytes (Caso Frontera):</w:t>
-      </w:r>
-      <w:r>
-        <w:t xml:space="preserve"> La Ficha 2 ocupa los bits [6, 7] del Byte 0 (bits menos significativos de la ficha) y el bit [0] del Byte 1 (bit más significativo).</w:t>
-      </w:r>
-    </w:p>
-    <w:p>
-      <w:r>
-        <w:t xml:space="preserve">Para manipular, aislar y reconstruir los datos sin recurrir a estructuras auxiliares, la solución implementa matemática binaria y operadores </w:t>
+      </w:pPr>
+      <w:r>
+        <w:rPr>
+          <w:rFonts w:ascii="Arial" w:hAnsi="Arial" w:cs="Arial"/>
+          <w:b/>
+          <w:bCs/>
+        </w:rPr>
+        <w:t>Introducción</w:t>
+      </w:r>
+    </w:p>
+    <w:p>
+      <w:pPr>
+        <w:rPr>
+          <w:rFonts w:ascii="Arial" w:hAnsi="Arial" w:cs="Arial"/>
+        </w:rPr>
+      </w:pPr>
+      <w:r>
+        <w:rPr>
+          <w:rFonts w:ascii="Arial" w:hAnsi="Arial" w:cs="Arial"/>
+        </w:rPr>
+        <w:t>El objetivo de este trabajo es analizar cómo se puede construir el juego Sweet Crush utilizando manipulación de bits en C++. La principal dificultad del proyecto está en la forma en que se debe almacenar el tablero, ya que cada ficha tiene que ocupar exactamente 3 bits.</w:t>
+      </w:r>
+    </w:p>
+    <w:p>
+      <w:pPr>
+        <w:rPr>
+          <w:rFonts w:ascii="Arial" w:hAnsi="Arial" w:cs="Arial"/>
+        </w:rPr>
+      </w:pPr>
+      <w:r>
+        <w:rPr>
+          <w:rFonts w:ascii="Arial" w:hAnsi="Arial" w:cs="Arial"/>
+        </w:rPr>
+        <w:t xml:space="preserve">Por esta razón, no se puede guardar cada ficha en un </w:t>
       </w:r>
       <w:proofErr w:type="spellStart"/>
       <w:r>
         <w:rPr>
-          <w:i/>
-          <w:iCs/>
+          <w:rFonts w:ascii="Arial" w:hAnsi="Arial" w:cs="Arial"/>
+        </w:rPr>
+        <w:t>char</w:t>
+      </w:r>
+      <w:proofErr w:type="spellEnd"/>
+      <w:r>
+        <w:rPr>
+          <w:rFonts w:ascii="Arial" w:hAnsi="Arial" w:cs="Arial"/>
+        </w:rPr>
+        <w:t xml:space="preserve">, un entero o una estructura independiente. En cambio, todas las fichas deben almacenarse de forma compacta dentro de una secuencia de bits. Esto hace necesario utilizar máscaras y operaciones </w:t>
+      </w:r>
+      <w:proofErr w:type="spellStart"/>
+      <w:r>
+        <w:rPr>
+          <w:rFonts w:ascii="Arial" w:hAnsi="Arial" w:cs="Arial"/>
         </w:rPr>
         <w:t>bitwise</w:t>
       </w:r>
       <w:proofErr w:type="spellEnd"/>
       <w:r>
-        <w:t>. La lectura se realiza mediante desplazamientos de bits (&lt;&lt;, &gt;&gt;) y máscaras de aislamiento AND (&amp;). La modificación de fichas se ejecuta en dos pasos: un limpiado previo mediante una máscara de ceros (&amp; ~</w:t>
+        <w:rPr>
+          <w:rFonts w:ascii="Arial" w:hAnsi="Arial" w:cs="Arial"/>
+        </w:rPr>
+        <w:t xml:space="preserve"> para poder leer, modificar y mover las fichas.</w:t>
+      </w:r>
+    </w:p>
+    <w:p>
+      <w:pPr>
+        <w:rPr>
+          <w:rFonts w:ascii="Arial" w:hAnsi="Arial" w:cs="Arial"/>
+        </w:rPr>
+      </w:pPr>
+      <w:r>
+        <w:rPr>
+          <w:rFonts w:ascii="Arial" w:hAnsi="Arial" w:cs="Arial"/>
+        </w:rPr>
+        <w:t>Además, el proyecto debe trabajar con memoria dinámica y punteros, utilizando C++ con Qt y una organización modular mediante archivos .h y .</w:t>
       </w:r>
       <w:proofErr w:type="spellStart"/>
       <w:r>
-        <w:t>mask</w:t>
+        <w:rPr>
+          <w:rFonts w:ascii="Arial" w:hAnsi="Arial" w:cs="Arial"/>
+        </w:rPr>
+        <w:t>cpp</w:t>
       </w:r>
       <w:proofErr w:type="spellEnd"/>
       <w:r>
-        <w:t>) seguido de la inserción del nuevo valor mediante superposición OR (|).</w:t>
-      </w:r>
-      <w:r>
+        <w:rPr>
+          <w:rFonts w:ascii="Arial" w:hAnsi="Arial" w:cs="Arial"/>
+        </w:rPr>
+        <w:t>.</w:t>
+      </w:r>
+    </w:p>
+    <w:p>
+      <w:pPr>
+        <w:rPr>
+          <w:rFonts w:ascii="Arial" w:hAnsi="Arial" w:cs="Arial"/>
+          <w:b/>
+          <w:bCs/>
+        </w:rPr>
+      </w:pPr>
+      <w:r>
+        <w:rPr>
+          <w:rFonts w:ascii="Arial" w:hAnsi="Arial" w:cs="Arial"/>
+          <w:b/>
+          <w:bCs/>
+        </w:rPr>
+        <w:t>1. Restricciones que determinan la solución</w:t>
+      </w:r>
+    </w:p>
+    <w:p>
+      <w:pPr>
+        <w:rPr>
+          <w:rFonts w:ascii="Arial" w:hAnsi="Arial" w:cs="Arial"/>
+        </w:rPr>
+      </w:pPr>
+      <w:r>
+        <w:rPr>
+          <w:rFonts w:ascii="Arial" w:hAnsi="Arial" w:cs="Arial"/>
+        </w:rPr>
+        <w:t>Una de las principales condiciones del proyecto es que el tablero debe almacenarse como una secuencia compacta de bits. Cada ficha ocupa 3 bits, por lo que existen ocho combinaciones posibles, aunque solamente seis corresponden a los tipos de fichas del juego. Las otras dos combinaciones pueden utilizarse para representar estados como una posición vacía.</w:t>
+      </w:r>
+    </w:p>
+    <w:p>
+      <w:pPr>
+        <w:rPr>
+          <w:rFonts w:ascii="Arial" w:hAnsi="Arial" w:cs="Arial"/>
+        </w:rPr>
+      </w:pPr>
+      <w:r>
+        <w:rPr>
+          <w:rFonts w:ascii="Arial" w:hAnsi="Arial" w:cs="Arial"/>
+        </w:rPr>
+        <w:t xml:space="preserve">La memoria utilizada debe ser dinámica y manejarse mediante un puntero compatible con bytes, por </w:t>
+      </w:r>
+      <w:proofErr w:type="gramStart"/>
+      <w:r>
+        <w:rPr>
+          <w:rFonts w:ascii="Arial" w:hAnsi="Arial" w:cs="Arial"/>
+        </w:rPr>
+        <w:t>ejemplo</w:t>
+      </w:r>
+      <w:proofErr w:type="gramEnd"/>
+      <w:r>
+        <w:rPr>
+          <w:rFonts w:ascii="Arial" w:hAnsi="Arial" w:cs="Arial"/>
+        </w:rPr>
         <w:t xml:space="preserve"> </w:t>
       </w:r>
-    </w:p>
-    <w:p>
-      <w:r>
-        <w:t xml:space="preserve">Ejemplo de uso de mascaras </w:t>
+      <w:proofErr w:type="spellStart"/>
+      <w:r>
+        <w:rPr>
+          <w:rFonts w:ascii="Arial" w:hAnsi="Arial" w:cs="Arial"/>
+        </w:rPr>
+        <w:t>unsigned</w:t>
+      </w:r>
+      <w:proofErr w:type="spellEnd"/>
+      <w:r>
+        <w:rPr>
+          <w:rFonts w:ascii="Arial" w:hAnsi="Arial" w:cs="Arial"/>
+        </w:rPr>
+        <w:t xml:space="preserve"> </w:t>
+      </w:r>
+      <w:proofErr w:type="spellStart"/>
+      <w:r>
+        <w:rPr>
+          <w:rFonts w:ascii="Arial" w:hAnsi="Arial" w:cs="Arial"/>
+        </w:rPr>
+        <w:t>char</w:t>
+      </w:r>
+      <w:proofErr w:type="spellEnd"/>
+      <w:r>
+        <w:rPr>
+          <w:rFonts w:ascii="Arial" w:hAnsi="Arial" w:cs="Arial"/>
+        </w:rPr>
+        <w:t>*. Es importante entender que un byte no representa una ficha completa, sino solamente una parte de la secuencia de bits donde están almacenadas varias fichas.</w:t>
+      </w:r>
+    </w:p>
+    <w:p>
+      <w:pPr>
+        <w:rPr>
+          <w:rFonts w:ascii="Arial" w:hAnsi="Arial" w:cs="Arial"/>
+        </w:rPr>
+      </w:pPr>
+      <w:r>
+        <w:rPr>
+          <w:rFonts w:ascii="Arial" w:hAnsi="Arial" w:cs="Arial"/>
+        </w:rPr>
+        <w:t>También está prohibido convertir el tablero de manera permanente a una estructura donde cada ficha ocupe un byte o un entero. Las operaciones deben realizarse directamente sobre la representación compacta.</w:t>
+      </w:r>
+    </w:p>
+    <w:p>
+      <w:pPr>
+        <w:rPr>
+          <w:rFonts w:ascii="Arial" w:hAnsi="Arial" w:cs="Arial"/>
+        </w:rPr>
+      </w:pPr>
+      <w:r>
+        <w:rPr>
+          <w:rFonts w:ascii="Arial" w:hAnsi="Arial" w:cs="Arial"/>
+        </w:rPr>
+        <w:t xml:space="preserve">El desarrollo se debe hacer utilizando C++ y Qt, programación modular, punteros, arreglos y memoria dinámica. De acuerdo con las restricciones de la práctica, no se deben utilizar </w:t>
+      </w:r>
+      <w:proofErr w:type="spellStart"/>
+      <w:r>
+        <w:rPr>
+          <w:rFonts w:ascii="Arial" w:hAnsi="Arial" w:cs="Arial"/>
+        </w:rPr>
+        <w:t>string</w:t>
+      </w:r>
+      <w:proofErr w:type="spellEnd"/>
+      <w:r>
+        <w:rPr>
+          <w:rFonts w:ascii="Arial" w:hAnsi="Arial" w:cs="Arial"/>
+        </w:rPr>
+        <w:t xml:space="preserve">, </w:t>
+      </w:r>
+      <w:proofErr w:type="spellStart"/>
+      <w:r>
+        <w:rPr>
+          <w:rFonts w:ascii="Arial" w:hAnsi="Arial" w:cs="Arial"/>
+        </w:rPr>
+        <w:t>struct</w:t>
+      </w:r>
+      <w:proofErr w:type="spellEnd"/>
+      <w:r>
+        <w:rPr>
+          <w:rFonts w:ascii="Arial" w:hAnsi="Arial" w:cs="Arial"/>
+        </w:rPr>
+        <w:t xml:space="preserve">, </w:t>
+      </w:r>
+      <w:proofErr w:type="spellStart"/>
+      <w:r>
+        <w:rPr>
+          <w:rFonts w:ascii="Arial" w:hAnsi="Arial" w:cs="Arial"/>
+        </w:rPr>
+        <w:t>class</w:t>
+      </w:r>
+      <w:proofErr w:type="spellEnd"/>
+      <w:r>
+        <w:rPr>
+          <w:rFonts w:ascii="Arial" w:hAnsi="Arial" w:cs="Arial"/>
+        </w:rPr>
+        <w:t xml:space="preserve">, </w:t>
+      </w:r>
+      <w:proofErr w:type="spellStart"/>
+      <w:r>
+        <w:rPr>
+          <w:rFonts w:ascii="Arial" w:hAnsi="Arial" w:cs="Arial"/>
+        </w:rPr>
+        <w:t>template</w:t>
+      </w:r>
+      <w:proofErr w:type="spellEnd"/>
+      <w:r>
+        <w:rPr>
+          <w:rFonts w:ascii="Arial" w:hAnsi="Arial" w:cs="Arial"/>
+        </w:rPr>
+        <w:t>, STL ni estructuras dinámicas proporcionadas por bibliotecas. Tampoco se debe utilizar sintaxis propia de ANSI C.</w:t>
+      </w:r>
+    </w:p>
+    <w:p>
+      <w:pPr>
+        <w:rPr>
+          <w:rFonts w:ascii="Arial" w:hAnsi="Arial" w:cs="Arial"/>
+        </w:rPr>
+      </w:pPr>
+      <w:r>
+        <w:rPr>
+          <w:rFonts w:ascii="Arial" w:hAnsi="Arial" w:cs="Arial"/>
+        </w:rPr>
+        <w:t>Para encontrar una ficha determinada dentro de la memoria, primero se calcula su posición en bits. Si p representa la posición lógica de la ficha:</w:t>
+      </w:r>
+    </w:p>
+    <w:p>
+      <w:pPr>
+        <w:rPr>
+          <w:rFonts w:ascii="Arial" w:hAnsi="Arial" w:cs="Arial"/>
+        </w:rPr>
+      </w:pPr>
+      <w:proofErr w:type="spellStart"/>
+      <w:r>
+        <w:rPr>
+          <w:rFonts w:ascii="Arial" w:hAnsi="Arial" w:cs="Arial"/>
+        </w:rPr>
+        <w:t>bitInicio</w:t>
+      </w:r>
+      <w:proofErr w:type="spellEnd"/>
+      <w:r>
+        <w:rPr>
+          <w:rFonts w:ascii="Arial" w:hAnsi="Arial" w:cs="Arial"/>
+        </w:rPr>
+        <w:t xml:space="preserve"> = p × 3</w:t>
+      </w:r>
+    </w:p>
+    <w:p>
+      <w:pPr>
+        <w:rPr>
+          <w:rFonts w:ascii="Arial" w:hAnsi="Arial" w:cs="Arial"/>
+        </w:rPr>
+      </w:pPr>
+      <w:r>
+        <w:rPr>
+          <w:rFonts w:ascii="Arial" w:hAnsi="Arial" w:cs="Arial"/>
+        </w:rPr>
+        <w:lastRenderedPageBreak/>
+        <w:t>Después se puede determinar en qué byte se encuentra y en qué posición dentro de ese byte comienza:</w:t>
+      </w:r>
+    </w:p>
+    <w:p>
+      <w:pPr>
+        <w:rPr>
+          <w:rFonts w:ascii="Arial" w:hAnsi="Arial" w:cs="Arial"/>
+        </w:rPr>
+      </w:pPr>
+      <w:proofErr w:type="spellStart"/>
+      <w:r>
+        <w:rPr>
+          <w:rFonts w:ascii="Arial" w:hAnsi="Arial" w:cs="Arial"/>
+        </w:rPr>
+        <w:t>byteInicio</w:t>
+      </w:r>
+      <w:proofErr w:type="spellEnd"/>
+      <w:r>
+        <w:rPr>
+          <w:rFonts w:ascii="Arial" w:hAnsi="Arial" w:cs="Arial"/>
+        </w:rPr>
+        <w:t xml:space="preserve"> = </w:t>
+      </w:r>
+      <w:proofErr w:type="spellStart"/>
+      <w:r>
+        <w:rPr>
+          <w:rFonts w:ascii="Arial" w:hAnsi="Arial" w:cs="Arial"/>
+        </w:rPr>
+        <w:t>bitInicio</w:t>
+      </w:r>
+      <w:proofErr w:type="spellEnd"/>
+      <w:r>
+        <w:rPr>
+          <w:rFonts w:ascii="Arial" w:hAnsi="Arial" w:cs="Arial"/>
+        </w:rPr>
+        <w:t xml:space="preserve"> / 8</w:t>
+      </w:r>
+    </w:p>
+    <w:p>
+      <w:pPr>
+        <w:rPr>
+          <w:rFonts w:ascii="Arial" w:hAnsi="Arial" w:cs="Arial"/>
+        </w:rPr>
+      </w:pPr>
+      <w:r>
+        <w:rPr>
+          <w:rFonts w:ascii="Arial" w:hAnsi="Arial" w:cs="Arial"/>
+        </w:rPr>
+        <w:t xml:space="preserve">offset = </w:t>
+      </w:r>
+      <w:proofErr w:type="spellStart"/>
+      <w:r>
+        <w:rPr>
+          <w:rFonts w:ascii="Arial" w:hAnsi="Arial" w:cs="Arial"/>
+        </w:rPr>
+        <w:t>bitInicio</w:t>
+      </w:r>
+      <w:proofErr w:type="spellEnd"/>
+      <w:r>
+        <w:rPr>
+          <w:rFonts w:ascii="Arial" w:hAnsi="Arial" w:cs="Arial"/>
+        </w:rPr>
+        <w:t xml:space="preserve"> % 8</w:t>
+      </w:r>
+    </w:p>
+    <w:p>
+      <w:pPr>
+        <w:rPr>
+          <w:rFonts w:ascii="Arial" w:hAnsi="Arial" w:cs="Arial"/>
+        </w:rPr>
+      </w:pPr>
+      <w:r>
+        <w:rPr>
+          <w:rFonts w:ascii="Arial" w:hAnsi="Arial" w:cs="Arial"/>
+        </w:rPr>
+        <w:t>Estos cálculos son fundamentales para prácticamente todas las operaciones del proyecto, como leer una ficha, modificarla, copiarla cuando cambia el tamaño del tablero o reorganizar sus posiciones.</w:t>
+      </w:r>
+    </w:p>
+    <w:p>
+      <w:pPr>
+        <w:rPr>
+          <w:rFonts w:ascii="Arial" w:hAnsi="Arial" w:cs="Arial"/>
+          <w:b/>
+          <w:bCs/>
+        </w:rPr>
+      </w:pPr>
+      <w:r>
+        <w:rPr>
+          <w:rFonts w:ascii="Arial" w:hAnsi="Arial" w:cs="Arial"/>
+          <w:b/>
+          <w:bCs/>
+        </w:rPr>
+        <w:t>3. Uso de máscaras</w:t>
+      </w:r>
+    </w:p>
+    <w:p>
+      <w:pPr>
+        <w:rPr>
+          <w:rFonts w:ascii="Arial" w:hAnsi="Arial" w:cs="Arial"/>
+        </w:rPr>
+      </w:pPr>
+      <w:r>
+        <w:rPr>
+          <w:rFonts w:ascii="Arial" w:hAnsi="Arial" w:cs="Arial"/>
+        </w:rPr>
+        <w:t>Las máscaras son una parte fundamental de la solución porque permiten trabajar solamente con los bits que interesan y dejar intactos los demás.</w:t>
+      </w:r>
+    </w:p>
+    <w:p>
+      <w:pPr>
+        <w:rPr>
+          <w:rFonts w:ascii="Arial" w:hAnsi="Arial" w:cs="Arial"/>
+        </w:rPr>
+      </w:pPr>
+      <w:r>
+        <w:rPr>
+          <w:rFonts w:ascii="Arial" w:hAnsi="Arial" w:cs="Arial"/>
+        </w:rPr>
+        <w:t>Para trabajar con tres bits se utiliza la máscara:</w:t>
+      </w:r>
+    </w:p>
+    <w:p>
+      <w:pPr>
+        <w:rPr>
+          <w:rFonts w:ascii="Arial" w:hAnsi="Arial" w:cs="Arial"/>
+        </w:rPr>
+      </w:pPr>
+      <w:r>
+        <w:rPr>
+          <w:rFonts w:ascii="Arial" w:hAnsi="Arial" w:cs="Arial"/>
+        </w:rPr>
+        <w:t>00000111 = 7</w:t>
+      </w:r>
+    </w:p>
+    <w:p>
+      <w:pPr>
+        <w:rPr>
+          <w:rFonts w:ascii="Arial" w:hAnsi="Arial" w:cs="Arial"/>
+        </w:rPr>
+      </w:pPr>
+      <w:r>
+        <w:rPr>
+          <w:rFonts w:ascii="Arial" w:hAnsi="Arial" w:cs="Arial"/>
+        </w:rPr>
+        <w:t>Por ejemplo, si los tres bits que queremos obtener están alineados en las posiciones menos significativas, podemos utilizar una operación AND:</w:t>
+      </w:r>
+    </w:p>
+    <w:p>
+      <w:pPr>
+        <w:rPr>
+          <w:rFonts w:ascii="Arial" w:hAnsi="Arial" w:cs="Arial"/>
+        </w:rPr>
+      </w:pPr>
+      <w:r>
+        <w:rPr>
+          <w:rFonts w:ascii="Arial" w:hAnsi="Arial" w:cs="Arial"/>
+        </w:rPr>
+        <w:t>valor = dato &amp; 00000111</w:t>
+      </w:r>
+    </w:p>
+    <w:p>
+      <w:pPr>
+        <w:rPr>
+          <w:rFonts w:ascii="Arial" w:hAnsi="Arial" w:cs="Arial"/>
+        </w:rPr>
+      </w:pPr>
+      <w:r>
+        <w:rPr>
+          <w:rFonts w:ascii="Arial" w:hAnsi="Arial" w:cs="Arial"/>
+        </w:rPr>
+        <w:t>La operación &amp; permite eliminar los bits que no nos interesan.</w:t>
+      </w:r>
+    </w:p>
+    <w:p>
+      <w:pPr>
+        <w:rPr>
+          <w:rFonts w:ascii="Arial" w:hAnsi="Arial" w:cs="Arial"/>
+        </w:rPr>
+      </w:pPr>
+      <w:r>
+        <w:rPr>
+          <w:rFonts w:ascii="Arial" w:hAnsi="Arial" w:cs="Arial"/>
+        </w:rPr>
+        <w:t>También es necesario desplazar las máscaras cuando la ficha comienza en otra posición del byte. Para eso se utiliza &lt;&lt;.</w:t>
+      </w:r>
+    </w:p>
+    <w:p>
+      <w:pPr>
+        <w:rPr>
+          <w:rFonts w:ascii="Arial" w:hAnsi="Arial" w:cs="Arial"/>
+        </w:rPr>
+      </w:pPr>
+      <w:r>
+        <w:rPr>
+          <w:rFonts w:ascii="Arial" w:hAnsi="Arial" w:cs="Arial"/>
+        </w:rPr>
+        <w:t>Por ejemplo, si queremos colocar los tres bits de la máscara en las posiciones 3, 4 y 5:</w:t>
+      </w:r>
+    </w:p>
+    <w:p>
+      <w:pPr>
+        <w:rPr>
+          <w:rFonts w:ascii="Arial" w:hAnsi="Arial" w:cs="Arial"/>
+        </w:rPr>
+      </w:pPr>
+      <w:r>
+        <w:rPr>
+          <w:rFonts w:ascii="Arial" w:hAnsi="Arial" w:cs="Arial"/>
+        </w:rPr>
+        <w:t>00000111 &lt;&lt; 3 = 00111000</w:t>
+      </w:r>
+    </w:p>
+    <w:p>
+      <w:pPr>
+        <w:rPr>
+          <w:rFonts w:ascii="Arial" w:hAnsi="Arial" w:cs="Arial"/>
+        </w:rPr>
+      </w:pPr>
+      <w:r>
+        <w:rPr>
+          <w:rFonts w:ascii="Arial" w:hAnsi="Arial" w:cs="Arial"/>
+        </w:rPr>
+        <w:t>Para borrar una ficha sin modificar los demás bits del byte, se puede complementar la máscara utilizando ~. Si la máscara es:</w:t>
+      </w:r>
+    </w:p>
+    <w:p>
+      <w:pPr>
+        <w:rPr>
+          <w:rFonts w:ascii="Arial" w:hAnsi="Arial" w:cs="Arial"/>
+        </w:rPr>
+      </w:pPr>
+      <w:r>
+        <w:rPr>
+          <w:rFonts w:ascii="Arial" w:hAnsi="Arial" w:cs="Arial"/>
+        </w:rPr>
+        <w:t>00111000</w:t>
+      </w:r>
+    </w:p>
+    <w:p>
+      <w:pPr>
+        <w:rPr>
+          <w:rFonts w:ascii="Arial" w:hAnsi="Arial" w:cs="Arial"/>
+        </w:rPr>
+      </w:pPr>
+      <w:r>
+        <w:rPr>
+          <w:rFonts w:ascii="Arial" w:hAnsi="Arial" w:cs="Arial"/>
+        </w:rPr>
+        <w:t>su complemento tendrá ceros precisamente en la zona que queremos borrar y unos en el resto. Entonces podemos hacer:</w:t>
+      </w:r>
+    </w:p>
+    <w:p>
+      <w:pPr>
+        <w:rPr>
+          <w:rFonts w:ascii="Arial" w:hAnsi="Arial" w:cs="Arial"/>
+        </w:rPr>
+      </w:pPr>
+      <w:r>
+        <w:rPr>
+          <w:rFonts w:ascii="Arial" w:hAnsi="Arial" w:cs="Arial"/>
+        </w:rPr>
+        <w:t>dato = dato &amp; ~máscara</w:t>
+      </w:r>
+    </w:p>
+    <w:p>
+      <w:pPr>
+        <w:rPr>
+          <w:rFonts w:ascii="Arial" w:hAnsi="Arial" w:cs="Arial"/>
+        </w:rPr>
+      </w:pPr>
+      <w:r>
+        <w:rPr>
+          <w:rFonts w:ascii="Arial" w:hAnsi="Arial" w:cs="Arial"/>
+        </w:rPr>
+        <w:t>Para insertar una nueva ficha, primero se limpia la zona correspondiente y después se coloca el nuevo valor:</w:t>
+      </w:r>
+    </w:p>
+    <w:p>
+      <w:pPr>
+        <w:rPr>
+          <w:rFonts w:ascii="Arial" w:hAnsi="Arial" w:cs="Arial"/>
+        </w:rPr>
+      </w:pPr>
+      <w:r>
+        <w:rPr>
+          <w:rFonts w:ascii="Arial" w:hAnsi="Arial" w:cs="Arial"/>
+        </w:rPr>
+        <w:lastRenderedPageBreak/>
+        <w:t>dato = dato &amp; ~máscara</w:t>
+      </w:r>
+    </w:p>
+    <w:p>
+      <w:pPr>
+        <w:rPr>
+          <w:rFonts w:ascii="Arial" w:hAnsi="Arial" w:cs="Arial"/>
+        </w:rPr>
+      </w:pPr>
+      <w:r>
+        <w:rPr>
+          <w:rFonts w:ascii="Arial" w:hAnsi="Arial" w:cs="Arial"/>
+        </w:rPr>
+        <w:t>dato = dato | ((valor &amp; 00000111) &lt;&lt; offset)</w:t>
+      </w:r>
+    </w:p>
+    <w:p>
+      <w:pPr>
+        <w:rPr>
+          <w:rFonts w:ascii="Arial" w:hAnsi="Arial" w:cs="Arial"/>
+        </w:rPr>
+      </w:pPr>
+      <w:r>
+        <w:rPr>
+          <w:rFonts w:ascii="Arial" w:hAnsi="Arial" w:cs="Arial"/>
+        </w:rPr>
+        <w:t>De esta manera se evita modificar accidentalmente los bits que pertenecen a otras fichas.</w:t>
+      </w:r>
+    </w:p>
+    <w:p>
+      <w:pPr>
+        <w:rPr>
+          <w:rFonts w:ascii="Arial" w:hAnsi="Arial" w:cs="Arial"/>
+          <w:b/>
+          <w:bCs/>
+        </w:rPr>
+      </w:pPr>
+      <w:r>
+        <w:rPr>
+          <w:rFonts w:ascii="Arial" w:hAnsi="Arial" w:cs="Arial"/>
+          <w:b/>
+          <w:bCs/>
+        </w:rPr>
+        <w:t>4. Extracción de una ficha</w:t>
+      </w:r>
+    </w:p>
+    <w:p>
+      <w:pPr>
+        <w:rPr>
+          <w:rFonts w:ascii="Arial" w:hAnsi="Arial" w:cs="Arial"/>
+        </w:rPr>
+      </w:pPr>
+      <w:r>
+        <w:rPr>
+          <w:rFonts w:ascii="Arial" w:hAnsi="Arial" w:cs="Arial"/>
+        </w:rPr>
+        <w:t>Supongamos que tenemos un byte con el valor:</w:t>
+      </w:r>
+    </w:p>
+    <w:p>
+      <w:pPr>
+        <w:rPr>
+          <w:rFonts w:ascii="Arial" w:hAnsi="Arial" w:cs="Arial"/>
+        </w:rPr>
+      </w:pPr>
+      <w:r>
+        <w:rPr>
+          <w:rFonts w:ascii="Arial" w:hAnsi="Arial" w:cs="Arial"/>
+        </w:rPr>
+        <w:t>10110110</w:t>
+      </w:r>
+    </w:p>
+    <w:p>
+      <w:pPr>
+        <w:rPr>
+          <w:rFonts w:ascii="Arial" w:hAnsi="Arial" w:cs="Arial"/>
+        </w:rPr>
+      </w:pPr>
+      <w:r>
+        <w:rPr>
+          <w:rFonts w:ascii="Arial" w:hAnsi="Arial" w:cs="Arial"/>
+        </w:rPr>
+        <w:t>y que la ficha comienza en el offset 2. Los tres bits que necesitamos son los bits 2, 3 y 4.</w:t>
+      </w:r>
+    </w:p>
+    <w:p>
+      <w:pPr>
+        <w:rPr>
+          <w:rFonts w:ascii="Arial" w:hAnsi="Arial" w:cs="Arial"/>
+        </w:rPr>
+      </w:pPr>
+      <w:r>
+        <w:rPr>
+          <w:rFonts w:ascii="Arial" w:hAnsi="Arial" w:cs="Arial"/>
+        </w:rPr>
+        <w:t>Primero se desplaza la máscara:</w:t>
+      </w:r>
+    </w:p>
+    <w:p>
+      <w:pPr>
+        <w:rPr>
+          <w:rFonts w:ascii="Arial" w:hAnsi="Arial" w:cs="Arial"/>
+        </w:rPr>
+      </w:pPr>
+      <w:r>
+        <w:rPr>
+          <w:rFonts w:ascii="Arial" w:hAnsi="Arial" w:cs="Arial"/>
+        </w:rPr>
+        <w:t>00000111 &lt;&lt; 2 = 00011100</w:t>
+      </w:r>
+    </w:p>
+    <w:p>
+      <w:pPr>
+        <w:rPr>
+          <w:rFonts w:ascii="Arial" w:hAnsi="Arial" w:cs="Arial"/>
+        </w:rPr>
+      </w:pPr>
+      <w:r>
+        <w:rPr>
+          <w:rFonts w:ascii="Arial" w:hAnsi="Arial" w:cs="Arial"/>
+        </w:rPr>
+        <w:t>Después se realiza la operación AND:</w:t>
+      </w:r>
+    </w:p>
+    <w:p>
+      <w:pPr>
+        <w:rPr>
+          <w:rFonts w:ascii="Arial" w:hAnsi="Arial" w:cs="Arial"/>
+        </w:rPr>
+      </w:pPr>
+      <w:r>
+        <w:rPr>
+          <w:rFonts w:ascii="Arial" w:hAnsi="Arial" w:cs="Arial"/>
+        </w:rPr>
+        <w:t>10110110 &amp; 00011100</w:t>
+      </w:r>
+    </w:p>
+    <w:p>
+      <w:pPr>
+        <w:rPr>
+          <w:rFonts w:ascii="Arial" w:hAnsi="Arial" w:cs="Arial"/>
+        </w:rPr>
+      </w:pPr>
+      <w:r>
+        <w:rPr>
+          <w:rFonts w:ascii="Arial" w:hAnsi="Arial" w:cs="Arial"/>
+        </w:rPr>
+        <w:t>Esto deja únicamente los tres bits correspondientes a la ficha. Finalmente, se realiza un desplazamiento hacia la derecha para llevarlos a las posiciones 0, 1 y 2 y obtener así el código de la ficha.</w:t>
+      </w:r>
+    </w:p>
+    <w:p>
+      <w:pPr>
+        <w:rPr>
+          <w:rFonts w:ascii="Arial" w:hAnsi="Arial" w:cs="Arial"/>
+        </w:rPr>
+      </w:pPr>
+      <w:r>
+        <w:rPr>
+          <w:rFonts w:ascii="Arial" w:hAnsi="Arial" w:cs="Arial"/>
+        </w:rPr>
+        <w:t>El caso más interesante aparece cuando la ficha comienza en el offset 7. En esta situación solamente uno de los tres bits cabe en el primer byte y los otros dos se encuentran en el byte siguiente.</w:t>
+      </w:r>
+    </w:p>
+    <w:p>
+      <w:pPr>
+        <w:rPr>
+          <w:rFonts w:ascii="Arial" w:hAnsi="Arial" w:cs="Arial"/>
+        </w:rPr>
+      </w:pPr>
+      <w:r>
+        <w:rPr>
+          <w:rFonts w:ascii="Arial" w:hAnsi="Arial" w:cs="Arial"/>
+        </w:rPr>
+        <w:t>Una forma sencilla de manejarlo es dividir la lectura en dos partes:</w:t>
+      </w:r>
+    </w:p>
+    <w:p>
+      <w:pPr>
+        <w:rPr>
+          <w:rFonts w:ascii="Arial" w:hAnsi="Arial" w:cs="Arial"/>
+        </w:rPr>
+      </w:pPr>
+      <w:r>
+        <w:rPr>
+          <w:rFonts w:ascii="Arial" w:hAnsi="Arial" w:cs="Arial"/>
+        </w:rPr>
+        <w:t>parte1 = (byte1 &gt;&gt; 7) &amp; 00000001</w:t>
+      </w:r>
+    </w:p>
+    <w:p>
+      <w:pPr>
+        <w:rPr>
+          <w:rFonts w:ascii="Arial" w:hAnsi="Arial" w:cs="Arial"/>
+        </w:rPr>
+      </w:pPr>
+      <w:r>
+        <w:rPr>
+          <w:rFonts w:ascii="Arial" w:hAnsi="Arial" w:cs="Arial"/>
+        </w:rPr>
+        <w:t>parte2 = byte2 &amp; 00000011</w:t>
+      </w:r>
+    </w:p>
+    <w:p>
+      <w:pPr>
+        <w:rPr>
+          <w:rFonts w:ascii="Arial" w:hAnsi="Arial" w:cs="Arial"/>
+        </w:rPr>
+      </w:pPr>
+      <w:r>
+        <w:rPr>
+          <w:rFonts w:ascii="Arial" w:hAnsi="Arial" w:cs="Arial"/>
+        </w:rPr>
+        <w:t>Después se combinan:</w:t>
+      </w:r>
+    </w:p>
+    <w:p>
+      <w:pPr>
+        <w:rPr>
+          <w:rFonts w:ascii="Arial" w:hAnsi="Arial" w:cs="Arial"/>
+        </w:rPr>
+      </w:pPr>
+      <w:proofErr w:type="spellStart"/>
+      <w:r>
+        <w:rPr>
+          <w:rFonts w:ascii="Arial" w:hAnsi="Arial" w:cs="Arial"/>
+        </w:rPr>
+        <w:t>codigo</w:t>
+      </w:r>
+      <w:proofErr w:type="spellEnd"/>
+      <w:r>
+        <w:rPr>
+          <w:rFonts w:ascii="Arial" w:hAnsi="Arial" w:cs="Arial"/>
+        </w:rPr>
+        <w:t xml:space="preserve"> = parte1 | (parte2 &lt;&lt; 1)</w:t>
+      </w:r>
+    </w:p>
+    <w:p>
+      <w:pPr>
+        <w:rPr>
+          <w:rFonts w:ascii="Arial" w:hAnsi="Arial" w:cs="Arial"/>
+        </w:rPr>
+      </w:pPr>
+      <w:r>
+        <w:rPr>
+          <w:rFonts w:ascii="Arial" w:hAnsi="Arial" w:cs="Arial"/>
+        </w:rPr>
+        <w:t>Este caso demuestra por qué es necesario trabajar directamente con bits, ya que una sola ficha puede estar almacenada parcialmente en dos bytes.</w:t>
+      </w:r>
+    </w:p>
+    <w:p>
+      <w:pPr>
+        <w:rPr>
+          <w:rFonts w:ascii="Arial" w:hAnsi="Arial" w:cs="Arial"/>
+          <w:b/>
+          <w:bCs/>
+        </w:rPr>
+      </w:pPr>
+      <w:r>
+        <w:rPr>
+          <w:rFonts w:ascii="Arial" w:hAnsi="Arial" w:cs="Arial"/>
+          <w:b/>
+          <w:bCs/>
+        </w:rPr>
+        <w:t>5. Conversión de fila y columna a una posición</w:t>
+      </w:r>
+    </w:p>
+    <w:p>
+      <w:pPr>
+        <w:rPr>
+          <w:rFonts w:ascii="Arial" w:hAnsi="Arial" w:cs="Arial"/>
+        </w:rPr>
+      </w:pPr>
+      <w:r>
+        <w:rPr>
+          <w:rFonts w:ascii="Arial" w:hAnsi="Arial" w:cs="Arial"/>
+        </w:rPr>
+        <w:lastRenderedPageBreak/>
+        <w:t>Aunque el tablero se visualiza como una matriz de filas y columnas, físicamente se almacena como una sola secuencia de bits.</w:t>
+      </w:r>
+    </w:p>
+    <w:p>
+      <w:pPr>
+        <w:rPr>
+          <w:rFonts w:ascii="Arial" w:hAnsi="Arial" w:cs="Arial"/>
+        </w:rPr>
+      </w:pPr>
+      <w:r>
+        <w:rPr>
+          <w:rFonts w:ascii="Arial" w:hAnsi="Arial" w:cs="Arial"/>
+        </w:rPr>
+        <w:t>Si se decide almacenar el tablero por filas, primero se convierte la posición (fila, columna) en una posición lineal. A partir de esa posición se calcula el inicio de la ficha:</w:t>
+      </w:r>
+    </w:p>
+    <w:p>
+      <w:pPr>
+        <w:rPr>
+          <w:rFonts w:ascii="Arial" w:hAnsi="Arial" w:cs="Arial"/>
+        </w:rPr>
+      </w:pPr>
+      <w:proofErr w:type="spellStart"/>
+      <w:r>
+        <w:rPr>
+          <w:rFonts w:ascii="Arial" w:hAnsi="Arial" w:cs="Arial"/>
+        </w:rPr>
+        <w:t>bitInicio</w:t>
+      </w:r>
+      <w:proofErr w:type="spellEnd"/>
+      <w:r>
+        <w:rPr>
+          <w:rFonts w:ascii="Arial" w:hAnsi="Arial" w:cs="Arial"/>
+        </w:rPr>
+        <w:t xml:space="preserve"> = </w:t>
+      </w:r>
+      <w:proofErr w:type="spellStart"/>
+      <w:r>
+        <w:rPr>
+          <w:rFonts w:ascii="Arial" w:hAnsi="Arial" w:cs="Arial"/>
+        </w:rPr>
+        <w:t>posicion</w:t>
+      </w:r>
+      <w:proofErr w:type="spellEnd"/>
+      <w:r>
+        <w:rPr>
+          <w:rFonts w:ascii="Arial" w:hAnsi="Arial" w:cs="Arial"/>
+        </w:rPr>
+        <w:t xml:space="preserve"> × 3</w:t>
+      </w:r>
+    </w:p>
+    <w:p>
+      <w:pPr>
+        <w:rPr>
+          <w:rFonts w:ascii="Arial" w:hAnsi="Arial" w:cs="Arial"/>
+        </w:rPr>
+      </w:pPr>
+      <w:r>
+        <w:rPr>
+          <w:rFonts w:ascii="Arial" w:hAnsi="Arial" w:cs="Arial"/>
+        </w:rPr>
+        <w:t>Esto permite separar la lógica del juego de la forma en que se almacena la información. Las funciones del juego pueden trabajar con filas y columnas, mientras que las funciones de acceso se encargan de traducir esas posiciones a los bits correspondientes.</w:t>
+      </w:r>
+    </w:p>
+    <w:p>
+      <w:pPr>
+        <w:rPr>
+          <w:rFonts w:ascii="Arial" w:hAnsi="Arial" w:cs="Arial"/>
+          <w:b/>
+          <w:bCs/>
+        </w:rPr>
+      </w:pPr>
+      <w:r>
+        <w:rPr>
+          <w:rFonts w:ascii="Arial" w:hAnsi="Arial" w:cs="Arial"/>
+          <w:b/>
+          <w:bCs/>
+        </w:rPr>
+        <w:t xml:space="preserve">7. </w:t>
+      </w:r>
+      <w:r>
+        <w:rPr>
+          <w:rFonts w:ascii="Arial" w:hAnsi="Arial" w:cs="Arial"/>
+          <w:b/>
+          <w:bCs/>
+        </w:rPr>
+        <w:t>cascadas</w:t>
+      </w:r>
+      <w:r>
+        <w:rPr>
+          <w:rFonts w:ascii="Arial" w:hAnsi="Arial" w:cs="Arial"/>
+          <w:b/>
+          <w:bCs/>
+        </w:rPr>
+        <w:t xml:space="preserve"> y nuevas fichas</w:t>
+      </w:r>
+    </w:p>
+    <w:p>
+      <w:pPr>
+        <w:rPr>
+          <w:rFonts w:ascii="Arial" w:hAnsi="Arial" w:cs="Arial"/>
+        </w:rPr>
+      </w:pPr>
+      <w:r>
+        <w:rPr>
+          <w:rFonts w:ascii="Arial" w:hAnsi="Arial" w:cs="Arial"/>
+        </w:rPr>
+        <w:t>Después de eliminar las fichas, es necesario aplicar la gravedad. Esto significa que las fichas que todavía existen deben bajar hasta ocupar las posiciones vacías que quedaron debajo.</w:t>
+      </w:r>
+    </w:p>
+    <w:p>
+      <w:pPr>
+        <w:rPr>
+          <w:rFonts w:ascii="Arial" w:hAnsi="Arial" w:cs="Arial"/>
+        </w:rPr>
+      </w:pPr>
+      <w:r>
+        <w:rPr>
+          <w:rFonts w:ascii="Arial" w:hAnsi="Arial" w:cs="Arial"/>
+        </w:rPr>
+        <w:t>Una forma de hacerlo es recorrer cada columna desde abajo hacia arriba y copiar las fichas que no estén vacías hacia las posiciones disponibles más bajas.</w:t>
+      </w:r>
+    </w:p>
+    <w:p>
+      <w:pPr>
+        <w:rPr>
+          <w:rFonts w:ascii="Arial" w:hAnsi="Arial" w:cs="Arial"/>
+        </w:rPr>
+      </w:pPr>
+      <w:r>
+        <w:rPr>
+          <w:rFonts w:ascii="Arial" w:hAnsi="Arial" w:cs="Arial"/>
+        </w:rPr>
+        <w:t>Una vez aplicada la gravedad, las posiciones que todavía estén vacías se deben rellenar con nuevas fichas.</w:t>
+      </w:r>
+    </w:p>
+    <w:p>
+      <w:pPr>
+        <w:rPr>
+          <w:rFonts w:ascii="Arial" w:hAnsi="Arial" w:cs="Arial"/>
+        </w:rPr>
+      </w:pPr>
+      <w:r>
+        <w:rPr>
+          <w:rFonts w:ascii="Arial" w:hAnsi="Arial" w:cs="Arial"/>
+        </w:rPr>
+        <w:t>Después de generar las nuevas fichas, se vuelve a revisar el tablero para comprobar si apareció alguna combinación nueva. Si ocurre, se repite el proceso de eliminación, gravedad y generación de fichas.</w:t>
+      </w:r>
+    </w:p>
+    <w:p>
+      <w:pPr>
+        <w:rPr>
+          <w:rFonts w:ascii="Arial" w:hAnsi="Arial" w:cs="Arial"/>
+        </w:rPr>
+      </w:pPr>
+      <w:r>
+        <w:rPr>
+          <w:rFonts w:ascii="Arial" w:hAnsi="Arial" w:cs="Arial"/>
+        </w:rPr>
+        <w:t>Este proceso puede continuar varias veces y es lo que permite representar las llamadas cascadas del juego.</w:t>
       </w:r>
     </w:p>
     <w:p/>
@@ -405,7 +1243,7 @@
 </file>
 
 <file path=word/numbering.xml><?xml version="1.0" encoding="utf-8"?>
-<w:numbering xmlns:wpc="http://schemas.microsoft.com/office/word/2010/wordprocessingCanvas" xmlns:cx="http://schemas.microsoft.com/office/drawing/2014/chartex" xmlns:cx1="http://schemas.microsoft.com/office/drawing/2015/9/8/chartex" xmlns:cx2="http://schemas.microsoft.com/office/drawing/2015/10/21/chartex" xmlns:cx3="http://schemas.microsoft.com/office/drawing/2016/5/9/chartex" xmlns:cx4="http://schemas.microsoft.com/office/drawing/2016/5/10/chartex" xmlns:cx5="http://schemas.microsoft.com/office/drawing/2016/5/11/chartex" xmlns:cx6="http://schemas.microsoft.com/office/drawing/2016/5/12/chartex" xmlns:cx7="http://schemas.microsoft.com/office/drawing/2016/5/13/chartex" xmlns:cx8="http://schemas.microsoft.com/office/drawing/2016/5/14/chartex" xmlns:mc="http://schemas.openxmlformats.org/markup-compatibility/2006" xmlns:aink="http://schemas.microsoft.com/office/drawing/2016/ink" xmlns:am3d="http://schemas.microsoft.com/office/drawing/2017/model3d" xmlns:o="urn:schemas-microsoft-com:office:office" xmlns:oel="http://schemas.microsoft.com/office/2019/extlst" xmlns:r="http://schemas.openxmlformats.org/officeDocument/2006/relationships" xmlns:m="http://schemas.openxmlformats.org/officeDocument/2006/math" xmlns:v="urn:schemas-microsoft-com:vml" xmlns:wp14="http://schemas.microsoft.com/office/word/2010/wordprocessingDrawing" xmlns:wp="http://schemas.openxmlformats.org/drawingml/2006/wordprocessingDrawing" xmlns:w10="urn:schemas-microsoft-com:office:word" xmlns:w="http://schemas.openxmlformats.org/wordprocessingml/2006/main" xmlns:w14="http://schemas.microsoft.com/office/word/2010/wordml" xmlns:w15="http://schemas.microsoft.com/office/word/2012/wordml" xmlns:w16cex="http://schemas.microsoft.com/office/word/2018/wordml/cex" xmlns:w16cid="http://schemas.microsoft.com/office/word/2016/wordml/cid" xmlns:w16="http://schemas.microsoft.com/office/word/2018/wordml" xmlns:w16sdtdh="http://schemas.microsoft.com/office/word/2020/wordml/sdtdatahash" xmlns:w16se="http://schemas.microsoft.com/office/word/2015/wordml/symex" xmlns:wpg="http://schemas.microsoft.com/office/word/2010/wordprocessingGroup" xmlns:wpi="http://schemas.microsoft.com/office/word/2010/wordprocessingInk" xmlns:wne="http://schemas.microsoft.com/office/word/2006/wordml" xmlns:wps="http://schemas.microsoft.com/office/word/2010/wordprocessingShape" mc:Ignorable="w14 w15 w16se w16cid w16 w16cex w16sdtdh wp14">
+<w:numbering xmlns:wpc="http://schemas.microsoft.com/office/word/2010/wordprocessingCanvas" xmlns:cx="http://schemas.microsoft.com/office/drawing/2014/chartex" xmlns:cx1="http://schemas.microsoft.com/office/drawing/2015/9/8/chartex" xmlns:cx2="http://schemas.microsoft.com/office/drawing/2015/10/21/chartex" xmlns:cx3="http://schemas.microsoft.com/office/drawing/2016/5/9/chartex" xmlns:cx4="http://schemas.microsoft.com/office/drawing/2016/5/10/chartex" xmlns:cx5="http://schemas.microsoft.com/office/drawing/2016/5/11/chartex" xmlns:cx6="http://schemas.microsoft.com/office/drawing/2016/5/12/chartex" xmlns:cx7="http://schemas.microsoft.com/office/drawing/2016/5/13/chartex" xmlns:cx8="http://schemas.microsoft.com/office/drawing/2016/5/14/chartex" xmlns:mc="http://schemas.openxmlformats.org/markup-compatibility/2006" xmlns:aink="http://schemas.microsoft.com/office/drawing/2016/ink" xmlns:am3d="http://schemas.microsoft.com/office/drawing/2017/model3d" xmlns:o="urn:schemas-microsoft-com:office:office" xmlns:oel="http://schemas.microsoft.com/office/2019/extlst" xmlns:r="http://schemas.openxmlformats.org/officeDocument/2006/relationships" xmlns:m="http://schemas.openxmlformats.org/officeDocument/2006/math" xmlns:v="urn:schemas-microsoft-com:vml" xmlns:wp14="http://schemas.microsoft.com/office/word/2010/wordprocessingDrawing" xmlns:wp="http://schemas.openxmlformats.org/drawingml/2006/wordprocessingDrawing" xmlns:w10="urn:schemas-microsoft-com:office:word" xmlns:w="http://schemas.openxmlformats.org/wordprocessingml/2006/main" xmlns:w14="http://schemas.microsoft.com/office/word/2010/wordml" xmlns:w15="http://schemas.microsoft.com/office/word/2012/wordml" xmlns:w16cex="http://schemas.microsoft.com/office/word/2018/wordml/cex" xmlns:w16cid="http://schemas.microsoft.com/office/word/2016/wordml/cid" xmlns:w16="http://schemas.microsoft.com/office/word/2018/wordml" xmlns:w16du="http://schemas.microsoft.com/office/word/2023/wordml/word16du" xmlns:w16sdtdh="http://schemas.microsoft.com/office/word/2020/wordml/sdtdatahash" xmlns:w16sdtfl="http://schemas.microsoft.com/office/word/2024/wordml/sdtformatlock" xmlns:w16se="http://schemas.microsoft.com/office/word/2015/wordml/symex" xmlns:wpg="http://schemas.microsoft.com/office/word/2010/wordprocessingGroup" xmlns:wpi="http://schemas.microsoft.com/office/word/2010/wordprocessingInk" xmlns:wne="http://schemas.microsoft.com/office/word/2006/wordml" xmlns:wps="http://schemas.microsoft.com/office/word/2010/wordprocessingShape" mc:Ignorable="w14 w15 w16se w16cid w16 w16cex w16sdtdh w16sdtfl w16du wp14">
   <w:abstractNum w:abstractNumId="0" w15:restartNumberingAfterBreak="0">
     <w:nsid w:val="35762129"/>
     <w:multiLevelType w:val="multilevel"/>
@@ -526,7 +1364,7 @@
 </file>
 
 <file path=word/styles.xml><?xml version="1.0" encoding="utf-8"?>
-<w:styles xmlns:mc="http://schemas.openxmlformats.org/markup-compatibility/2006" xmlns:r="http://schemas.openxmlformats.org/officeDocument/2006/relationships" xmlns:w="http://schemas.openxmlformats.org/wordprocessingml/2006/main" xmlns:w14="http://schemas.microsoft.com/office/word/2010/wordml" xmlns:w15="http://schemas.microsoft.com/office/word/2012/wordml" xmlns:w16cex="http://schemas.microsoft.com/office/word/2018/wordml/cex" xmlns:w16cid="http://schemas.microsoft.com/office/word/2016/wordml/cid" xmlns:w16="http://schemas.microsoft.com/office/word/2018/wordml" xmlns:w16sdtdh="http://schemas.microsoft.com/office/word/2020/wordml/sdtdatahash" xmlns:w16se="http://schemas.microsoft.com/office/word/2015/wordml/symex" mc:Ignorable="w14 w15 w16se w16cid w16 w16cex w16sdtdh">
+<w:styles xmlns:mc="http://schemas.openxmlformats.org/markup-compatibility/2006" xmlns:r="http://schemas.openxmlformats.org/officeDocument/2006/relationships" xmlns:w="http://schemas.openxmlformats.org/wordprocessingml/2006/main" xmlns:w14="http://schemas.microsoft.com/office/word/2010/wordml" xmlns:w15="http://schemas.microsoft.com/office/word/2012/wordml" xmlns:w16cex="http://schemas.microsoft.com/office/word/2018/wordml/cex" xmlns:w16cid="http://schemas.microsoft.com/office/word/2016/wordml/cid" xmlns:w16="http://schemas.microsoft.com/office/word/2018/wordml" xmlns:w16du="http://schemas.microsoft.com/office/word/2023/wordml/word16du" xmlns:w16sdtdh="http://schemas.microsoft.com/office/word/2020/wordml/sdtdatahash" xmlns:w16sdtfl="http://schemas.microsoft.com/office/word/2024/wordml/sdtformatlock" xmlns:w16se="http://schemas.microsoft.com/office/word/2015/wordml/symex" mc:Ignorable="w14 w15 w16se w16cid w16 w16cex w16sdtdh w16sdtfl w16du">
   <w:docDefaults>
     <w:rPrDefault>
       <w:rPr>

</xml_diff>